<commit_message>
Make closing audience questions attention checks on the talk content
Co-Authored-By: Claude Opus 5.5 <noreply@anthropic.com>
Claude-Session: https://claude.ai/code/session_019XwRdqvMoKnJvFiroXySfz
</commit_message>
<xml_diff>
--- a/cifrovizaciya/Доклад_Цифровизация_общества_РФ.docx
+++ b/cifrovizaciya/Доклад_Цифровизация_общества_РФ.docx
@@ -900,7 +900,7 @@
           <w:sz w:val="23"/>
           <w:szCs w:val="23"/>
         </w:rPr>
-        <w:t xml:space="preserve">СВЕТА  ·  Вопросы для зала</w:t>
+        <w:t xml:space="preserve">СВЕТА  ·  Вопросы для зала: проверка внимательности</w:t>
       </w:r>
     </w:p>
     <w:p>
@@ -918,7 +918,7 @@
           <w:sz w:val="22"/>
           <w:szCs w:val="22"/>
         </w:rPr>
-        <w:t xml:space="preserve">1. Угадайте: в каком году у Рунета появился собственный домен .RU?</w:t>
+        <w:t xml:space="preserve">1. В каком году открылся портал Госуслуг?</w:t>
       </w:r>
     </w:p>
     <w:p>
@@ -935,7 +935,7 @@
           <w:sz w:val="22"/>
           <w:szCs w:val="22"/>
         </w:rPr>
-        <w:t xml:space="preserve">Ответ: 7 апреля 1994 года — российскому интернету уже больше 30 лет, он старше большинства сидящих в зале.</w:t>
+        <w:t xml:space="preserve">Ответ: 15 декабря 2009 года (слайд 4, рассказывал Егор).</w:t>
       </w:r>
     </w:p>
     <w:p>
@@ -953,7 +953,7 @@
           <w:sz w:val="22"/>
           <w:szCs w:val="22"/>
         </w:rPr>
-        <w:t xml:space="preserve">2. Как вы думаете, сколько человек зарегистрировано на Госуслугах: 30, 70 или больше 110 миллионов?</w:t>
+        <w:t xml:space="preserve">2. С какого года в России законом разрешена телемедицина — консультация врача по видеосвязи?</w:t>
       </w:r>
     </w:p>
     <w:p>
@@ -970,7 +970,7 @@
           <w:sz w:val="22"/>
           <w:szCs w:val="22"/>
         </w:rPr>
-        <w:t xml:space="preserve">Ответ: больше 112 миллионов к концу 2024 года, а летом 2025 года Минцифры называло уже 117 миллионов — около 95% россиян старше 14 лет.</w:t>
+        <w:t xml:space="preserve">Ответ: с 1 января 2018 года (слайд 6, рассказывала Света).</w:t>
       </w:r>
     </w:p>
     <w:p>
@@ -988,7 +988,7 @@
           <w:sz w:val="22"/>
           <w:szCs w:val="22"/>
         </w:rPr>
-        <w:t xml:space="preserve">3. Представьте, что завтра на неделю отключили все цифровые сервисы. Без чего вам было бы тяжелее всего — и почему?</w:t>
+        <w:t xml:space="preserve">3. Как называется система, которая позволяет оплатить проезд в московском метро «по лицу», и когда она появилась?</w:t>
       </w:r>
     </w:p>
     <w:p>
@@ -1005,7 +1005,7 @@
           <w:sz w:val="22"/>
           <w:szCs w:val="22"/>
         </w:rPr>
-        <w:t xml:space="preserve">Вопрос для обсуждения: правильного ответа нет. Обычно называют мессенджеры, онлайн-оплату и навигатор — хороший повод вспомнить, насколько цифра стала «средой жизни».</w:t>
+        <w:t xml:space="preserve">Ответ: Face Pay, с октября 2021 года (слайд 7).</w:t>
       </w:r>
     </w:p>
     <w:p>

</xml_diff>

<commit_message>
Alternate speakers slide by slide, drop introduction line
Co-Authored-By: Claude Opus 5.5 <noreply@anthropic.com>
Claude-Session: https://claude.ai/code/session_019XwRdqvMoKnJvFiroXySfz
</commit_message>
<xml_diff>
--- a/cifrovizaciya/Доклад_Цифровизация_общества_РФ.docx
+++ b/cifrovizaciya/Доклад_Цифровизация_общества_РФ.docx
@@ -44,6 +44,15 @@
       <w:r>
         <w:rPr>
           <w:rFonts w:ascii="Calibri" w:cs="Calibri" w:eastAsia="Calibri" w:hAnsi="Calibri"/>
+          <w:color w:val="000000"/>
+          <w:sz w:val="22"/>
+          <w:szCs w:val="22"/>
+        </w:rPr>
+        <w:t xml:space="preserve">Рассказываем по очереди: </w:t>
+      </w:r>
+      <w:r>
+        <w:rPr>
+          <w:rFonts w:ascii="Calibri" w:cs="Calibri" w:eastAsia="Calibri" w:hAnsi="Calibri"/>
           <w:b/>
           <w:bCs/>
           <w:color w:val="000000"/>
@@ -59,7 +68,7 @@
           <w:sz w:val="22"/>
           <w:szCs w:val="22"/>
         </w:rPr>
-        <w:t xml:space="preserve"> — слайды 1–5 (введение, история Рунета, интернет дома, Госуслуги, школа).   </w:t>
+        <w:t xml:space="preserve"> — слайды 1, 3, 5, 7, 9;  </w:t>
       </w:r>
       <w:r>
         <w:rPr>
@@ -79,7 +88,7 @@
           <w:sz w:val="22"/>
           <w:szCs w:val="22"/>
         </w:rPr>
-        <w:t xml:space="preserve"> — слайды 6–10 (медицина, город и досуг, пандемия, риски, итог и вопросы залу).</w:t>
+        <w:t xml:space="preserve"> — слайды 2, 4, 6, 8, 10 и вопросы для зала.</w:t>
       </w:r>
     </w:p>
     <w:p>
@@ -126,22 +135,22 @@
           <w:sz w:val="22"/>
           <w:szCs w:val="22"/>
         </w:rPr>
-        <w:t xml:space="preserve">Добрый день! Меня зовут Егор, а это Света. Тема нашего доклада — как цифровизация входила в жизнь общества России. Сразу оговоримся: мы не будем говорить об экономике, ВВП и рынке IT. Нас интересует другое — как цифровые технологии изменили повседневную жизнь обычного человека: как мы общаемся, учимся, лечимся, ездим по городу, ходим в театр и решаем вопросы с государством.</w:t>
-      </w:r>
-    </w:p>
-    <w:p>
-      <w:pPr>
-        <w:spacing w:after="60" w:before="0" w:line="264"/>
-        <w:jc w:val="both"/>
-      </w:pPr>
-      <w:r>
-        <w:rPr>
-          <w:rFonts w:ascii="Calibri" w:cs="Calibri" w:eastAsia="Calibri" w:hAnsi="Calibri"/>
-          <w:color w:val="000000"/>
-          <w:sz w:val="22"/>
-          <w:szCs w:val="22"/>
-        </w:rPr>
-        <w:t xml:space="preserve">Ещё тридцать лет назад интернет в России был диковинкой для учёных и энтузиастов. Сегодня у большинства из нас в кармане смартфон, через который можно записаться к врачу, проверить оценки ребёнка, оплатить проезд и купить билет в музей. Как мы к этому пришли — об этом и поговорим. Первую часть расскажу я, вторую — Света.</w:t>
+        <w:t xml:space="preserve">Добрый день! Тема нашего доклада — как цифровизация входила в жизнь общества России. Сразу оговоримся: мы не будем говорить об экономике, ВВП и рынке IT. Нас интересует другое — как цифровые технологии изменили повседневную жизнь обычного человека: как мы общаемся, учимся, лечимся, ездим по городу, ходим в театр и решаем вопросы с государством.</w:t>
+      </w:r>
+    </w:p>
+    <w:p>
+      <w:pPr>
+        <w:spacing w:after="60" w:before="0" w:line="264"/>
+        <w:jc w:val="both"/>
+      </w:pPr>
+      <w:r>
+        <w:rPr>
+          <w:rFonts w:ascii="Calibri" w:cs="Calibri" w:eastAsia="Calibri" w:hAnsi="Calibri"/>
+          <w:color w:val="000000"/>
+          <w:sz w:val="22"/>
+          <w:szCs w:val="22"/>
+        </w:rPr>
+        <w:t xml:space="preserve">Ещё тридцать лет назад интернет в России был диковинкой для учёных и энтузиастов. Сегодня у большинства из нас в кармане смартфон, через который можно записаться к врачу, проверить оценки ребёнка, оплатить проезд и купить билет в музей. Как мы к этому пришли — об этом и поговорим.</w:t>
       </w:r>
     </w:p>
     <w:p>
@@ -162,7 +171,7 @@
           <w:sz w:val="23"/>
           <w:szCs w:val="23"/>
         </w:rPr>
-        <w:t xml:space="preserve">ЕГОР  ·  Слайд 2. Как всё начиналось: 1994–2009</w:t>
+        <w:t xml:space="preserve">СВЕТА  ·  Слайд 2. Как всё начиналось: 1994–2009</w:t>
       </w:r>
       <w:r>
         <w:rPr>
@@ -331,7 +340,7 @@
           <w:sz w:val="23"/>
           <w:szCs w:val="23"/>
         </w:rPr>
-        <w:t xml:space="preserve">ЕГОР  ·  Слайд 4. Госуслуги: государство в смартфоне</w:t>
+        <w:t xml:space="preserve">СВЕТА  ·  Слайд 4. Госуслуги: государство в смартфоне</w:t>
       </w:r>
       <w:r>
         <w:rPr>
@@ -469,21 +478,6 @@
     </w:p>
     <w:p>
       <w:pPr>
-        <w:spacing w:after="60" w:before="0" w:line="264"/>
-        <w:jc w:val="both"/>
-      </w:pPr>
-      <w:r>
-        <w:rPr>
-          <w:rFonts w:ascii="Calibri" w:cs="Calibri" w:eastAsia="Calibri" w:hAnsi="Calibri"/>
-          <w:color w:val="000000"/>
-          <w:sz w:val="22"/>
-          <w:szCs w:val="22"/>
-        </w:rPr>
-        <w:t xml:space="preserve">На этом моя часть заканчивается. Передаю слово Свете — она расскажет, как цифра изменила медицину, городскую жизнь и что принесла пандемия.</w:t>
-      </w:r>
-    </w:p>
-    <w:p>
-      <w:pPr>
         <w:keepNext/>
         <w:pBdr>
           <w:bottom w:val="single" w:color="000000" w:sz="4" w:space="1"/>
@@ -526,7 +520,7 @@
           <w:sz w:val="22"/>
           <w:szCs w:val="22"/>
         </w:rPr>
-        <w:t xml:space="preserve">Спасибо, Егор! Посмотрим на цифровизацию глазами пациента. Первый шаг — запись к врачу. Раньше люди занимали очередь в регистратуру с утра, сегодня записаться можно через Госуслуги, региональный портал или приложение поликлиники.</w:t>
+        <w:t xml:space="preserve">Посмотрим на цифровизацию глазами пациента. Первый шаг — запись к врачу. Раньше люди занимали очередь в регистратуру с утра, сегодня записаться можно через Госуслуги, региональный портал или приложение поликлиники.</w:t>
       </w:r>
     </w:p>
     <w:p>
@@ -577,7 +571,7 @@
           <w:sz w:val="23"/>
           <w:szCs w:val="23"/>
         </w:rPr>
-        <w:t xml:space="preserve">СВЕТА  ·  Слайд 7. Город и досуг: цифра в повседневности</w:t>
+        <w:t xml:space="preserve">ЕГОР  ·  Слайд 7. Город и досуг: цифра в повседневности</w:t>
       </w:r>
       <w:r>
         <w:rPr>
@@ -731,7 +725,7 @@
           <w:sz w:val="23"/>
           <w:szCs w:val="23"/>
         </w:rPr>
-        <w:t xml:space="preserve">СВЕТА  ·  Слайд 9. Обратная сторона цифровизации</w:t>
+        <w:t xml:space="preserve">ЕГОР  ·  Слайд 9. Обратная сторона цифровизации</w:t>
       </w:r>
       <w:r>
         <w:rPr>
@@ -935,7 +929,7 @@
           <w:sz w:val="22"/>
           <w:szCs w:val="22"/>
         </w:rPr>
-        <w:t xml:space="preserve">Ответ: 15 декабря 2009 года (слайд 4, рассказывал Егор).</w:t>
+        <w:t xml:space="preserve">Ответ: 15 декабря 2009 года (слайд 4, рассказывала Света).</w:t>
       </w:r>
     </w:p>
     <w:p>

</xml_diff>